<commit_message>
Simplify pgAdmin backup and restore Word guide
</commit_message>
<xml_diff>
--- a/docs/backup-restore-pgadmin.docx
+++ b/docs/backup-restore-pgadmin.docx
@@ -7,7 +7,121 @@
         <w:pStyle w:val="Title"/>
       </w:pPr>
       <w:r>
-        <w:t>Administracja bazy danych kopia zapasowa i odtwarzanie</w:t>
+        <w:t>Kopia zapasowa i odtwarzanie tabeli w pgAdmin</w:t>
+      </w:r>
+    </w:p>
+    <w:p>
+      <w:r>
+        <w:t>Baza testowa: task_manager_2. Tabela: public.comment. Backup jest wykonany; usuwanie i odtwarzanie pozostają do wykonania.</w:t>
+      </w:r>
+    </w:p>
+    <w:p>
+      <w:pPr>
+        <w:pStyle w:val="Heading1"/>
+      </w:pPr>
+      <w:r>
+        <w:t>1 Backup</w:t>
+      </w:r>
+    </w:p>
+    <w:p>
+      <w:r>
+        <w:t>Kliknij prawym przyciskiem comment → Backup. Format: Custom. Filename: D:\task_manager_2_comment_2026-10-16.backup. Kliknij Backup i sprawdź w Processes status Finished.</w:t>
+      </w:r>
+    </w:p>
+    <w:p>
+      <w:pPr>
+        <w:pStyle w:val="Heading1"/>
+      </w:pPr>
+      <w:r>
+        <w:t>2 Usuń tabelę</w:t>
+      </w:r>
+    </w:p>
+    <w:p>
+      <w:r>
+        <w:t>Dopiero po sprawdzeniu kopii wykonaj w Query Tool:</w:t>
+      </w:r>
+    </w:p>
+    <w:p>
+      <w:pPr>
+        <w:ind w:left="288"/>
+      </w:pPr>
+      <w:r>
+        <w:rPr>
+          <w:rFonts w:ascii="Consolas" w:hAnsi="Consolas"/>
+          <w:sz w:val="18"/>
+        </w:rPr>
+        <w:t>DROP TABLE public.comment;</w:t>
+      </w:r>
+    </w:p>
+    <w:p>
+      <w:pPr>
+        <w:pStyle w:val="Heading1"/>
+      </w:pPr>
+      <w:r>
+        <w:t>3 Sprawdź brak tabeli</w:t>
+      </w:r>
+    </w:p>
+    <w:p>
+      <w:r>
+        <w:t>Odśwież public → Tables. Tabela comment powinna zniknąć. Możesz potwierdzić to zapytaniem:</w:t>
+      </w:r>
+    </w:p>
+    <w:p>
+      <w:pPr>
+        <w:ind w:left="288"/>
+      </w:pPr>
+      <w:r>
+        <w:rPr>
+          <w:rFonts w:ascii="Consolas" w:hAnsi="Consolas"/>
+          <w:sz w:val="18"/>
+        </w:rPr>
+        <w:t>SELECT to_regclass('public.comment') AS tabela;</w:t>
+      </w:r>
+    </w:p>
+    <w:p>
+      <w:pPr>
+        <w:pStyle w:val="Heading1"/>
+      </w:pPr>
+      <w:r>
+        <w:t>4 Restore</w:t>
+      </w:r>
+    </w:p>
+    <w:p>
+      <w:r>
+        <w:t>Kliknij prawym przyciskiem bazę task_manager_2 → Restore. Wybierz plik backup, format Custom i kliknij Restore. W Processes sprawdź Finished.</w:t>
+      </w:r>
+    </w:p>
+    <w:p>
+      <w:pPr>
+        <w:pStyle w:val="Heading1"/>
+      </w:pPr>
+      <w:r>
+        <w:t>5 Sprawdź dane</w:t>
+      </w:r>
+    </w:p>
+    <w:p>
+      <w:r>
+        <w:t>Po odświeżeniu Tables wykonaj:</w:t>
+      </w:r>
+    </w:p>
+    <w:p>
+      <w:pPr>
+        <w:ind w:left="288"/>
+      </w:pPr>
+      <w:r>
+        <w:rPr>
+          <w:rFonts w:ascii="Consolas" w:hAnsi="Consolas"/>
+          <w:sz w:val="18"/>
+        </w:rPr>
+        <w:t>SELECT id, content, task_id, user_id FROM public.comment ORDER BY id;</w:t>
+      </w:r>
+    </w:p>
+    <w:p>
+      <w:pPr>
+        <w:pStyle w:val="Heading1"/>
+      </w:pPr>
+      <w:r>
+        <w:t>Zrzuty ekranu</w:t>
       </w:r>
     </w:p>
     <w:p>
@@ -15,129 +129,17 @@
         <w:rPr>
           <w:b/>
         </w:rPr>
-        <w:t xml:space="preserve">Ćwiczenie w pgAdmin 4 dla bazy task_manager_2. </w:t>
-      </w:r>
-      <w:r>
-        <w:t>Celem jest zapisanie kopii tabeli public.comment, usunięcie tej tabeli w bazie testowej i odtworzenie jej z pliku. Tabela comment została wybrana, ponieważ nie trzeba przy tym usuwać powiązanych tabel users i tasks.</w:t>
-      </w:r>
-    </w:p>
-    <w:p>
-      <w:r>
-        <w:rPr>
-          <w:b/>
-        </w:rPr>
-        <w:t xml:space="preserve">Zakres: </w:t>
-      </w:r>
-      <w:r>
-        <w:t>backup → DROP TABLE → potwierdzenie braku tabeli → restore → SELECT. Przed usunięciem sprawdź, czy proces kopii zakończył się pomyślnie i czy plik istnieje.</w:t>
-      </w:r>
-    </w:p>
-    <w:p>
-      <w:r>
-        <w:rPr>
-          <w:b/>
-        </w:rPr>
-        <w:t xml:space="preserve">Stan wykonania: </w:t>
-      </w:r>
-      <w:r>
-        <w:t>backup został wykonany i udokumentowany. Etapy 2–5 są instrukcją do samodzielnego wykonania; pola na ich zrzuty pozostają puste, ponieważ tabela nie została usunięta.</w:t>
+        <w:t>1 Backup zakończony</w:t>
       </w:r>
     </w:p>
     <w:p>
       <w:pPr>
-        <w:pStyle w:val="Heading1"/>
-      </w:pPr>
-      <w:r>
-        <w:t>Miejsce na plik kopii</w:t>
-      </w:r>
-    </w:p>
-    <w:p>
-      <w:r>
-        <w:rPr>
-          <w:b/>
-        </w:rPr>
-        <w:t xml:space="preserve">Plik ćwiczeniowy: </w:t>
-      </w:r>
-      <w:r>
-        <w:t>D:\task_manager_2_comment_2026-10-16.backup</w:t>
-      </w:r>
-    </w:p>
-    <w:p>
-      <w:r>
-        <w:t>D: jest innym woluminem, ale sama litera dysku nie dowodzi, że to osobny dysk fizyczny. Do przechowywania kopii poza komputerem wybierz dysk zewnętrzny albo udział sieciowy i sprawdź, czy plik da się odczytać.</w:t>
-      </w:r>
-    </w:p>
-    <w:p>
-      <w:r>
-        <w:rPr>
-          <w:b/>
-        </w:rPr>
-        <w:t>Moje wyjaśnienie dlaczego kopia na tym samym dysku nie wystarcza</w:t>
-      </w:r>
-    </w:p>
-    <w:p>
-      <w:r>
-        <w:rPr>
-          <w:i/>
-        </w:rPr>
-        <w:t>Wpisz samodzielnie 2–3 zdania. Odnieś się do awarii lub utraty całego dysku oraz do miejsca, z którego można wtedy odzyskać plik.</w:t>
-      </w:r>
-    </w:p>
-    <w:p>
-      <w:r>
-        <w:t>................................................................................................................</w:t>
-      </w:r>
-    </w:p>
-    <w:p>
-      <w:r>
-        <w:t>................................................................................................................</w:t>
-      </w:r>
-    </w:p>
-    <w:p>
-      <w:r>
-        <w:t>................................................................................................................</w:t>
-      </w:r>
-    </w:p>
-    <w:p>
-      <w:pPr>
-        <w:pStyle w:val="Heading1"/>
-      </w:pPr>
-      <w:r>
-        <w:t>1 Utworzenie kopii</w:t>
-      </w:r>
-    </w:p>
-    <w:p>
-      <w:r>
-        <w:t>W Object Explorer rozwiń task manager db → Databases → task_manager_2 → Schemas → public → Tables. Kliknij prawym przyciskiem tabelę comment i wybierz Backup. W General ustaw Filename na podaną wyżej ścieżkę oraz Format na Custom. Pozostaw kopię schematu i danych, po czym kliknij Backup.</w:t>
-      </w:r>
-    </w:p>
-    <w:p>
-      <w:r>
-        <w:t>Na karcie Processes sprawdź status Finished. Otwórz szczegóły procesu: powinny wskazywać public.comment i komunikat Successfully completed. Sprawdź też, czy plik ma niezerowy rozmiar.</w:t>
-      </w:r>
-    </w:p>
-    <w:p>
-      <w:pPr>
-        <w:keepNext/>
-      </w:pPr>
-      <w:r>
-        <w:rPr>
-          <w:b/>
-        </w:rPr>
-        <w:t xml:space="preserve">Zrzut 1. </w:t>
-      </w:r>
-      <w:r>
-        <w:t>Ukończony backup tabeli comment</w:t>
-      </w:r>
-    </w:p>
-    <w:p>
-      <w:pPr>
-        <w:spacing w:after="160"/>
+        <w:spacing w:after="100"/>
       </w:pPr>
       <w:r>
         <w:drawing>
           <wp:inline xmlns:a="http://schemas.openxmlformats.org/drawingml/2006/main" xmlns:pic="http://schemas.openxmlformats.org/drawingml/2006/picture">
-            <wp:extent cx="6309360" cy="3351848"/>
+            <wp:extent cx="5394960" cy="2868320"/>
             <wp:docPr id="1" name="Picture 1"/>
             <wp:cNvGraphicFramePr>
               <a:graphicFrameLocks noChangeAspect="1"/>
@@ -146,7 +148,7 @@
               <a:graphicData uri="http://schemas.openxmlformats.org/drawingml/2006/picture">
                 <pic:pic>
                   <pic:nvPicPr>
-                    <pic:cNvPr id="0" name="01-backup.png"/>
+                    <pic:cNvPr id="0" name="backup-small.jpg"/>
                     <pic:cNvPicPr/>
                   </pic:nvPicPr>
                   <pic:blipFill>
@@ -158,7 +160,7 @@
                   <pic:spPr>
                     <a:xfrm>
                       <a:off x="0" y="0"/>
-                      <a:ext cx="6309360" cy="3351848"/>
+                      <a:ext cx="5394960" cy="2868320"/>
                     </a:xfrm>
                     <a:prstGeom prst="rect"/>
                   </pic:spPr>
@@ -170,56 +172,23 @@
       </w:r>
     </w:p>
     <w:p>
-      <w:pPr>
-        <w:pStyle w:val="Heading1"/>
-      </w:pPr>
       <w:r>
-        <w:t>2 Usunięcie tabeli testowej</w:t>
+        <w:t>2 DROP TABLE — do wstawienia</w:t>
       </w:r>
     </w:p>
     <w:p>
       <w:r>
-        <w:t>Po potwierdzeniu kopii otwórz Query Tool bazy task_manager_2. Wykonaj poniższe polecenie. Usuwamy comment, a nie users: users jest powiązana kluczami obcymi z tasks i comment.</w:t>
-      </w:r>
-    </w:p>
-    <w:p>
-      <w:pPr>
-        <w:spacing w:before="60" w:after="160"/>
-        <w:ind w:left="288"/>
-      </w:pPr>
-      <w:r>
-        <w:rPr>
-          <w:rFonts w:ascii="Consolas" w:hAnsi="Consolas"/>
-          <w:sz w:val="19"/>
-        </w:rPr>
-        <w:t>DROP TABLE public.comment;</w:t>
+        <w:t>3 Brak tabeli — do wstawienia</w:t>
       </w:r>
     </w:p>
     <w:p>
       <w:r>
-        <w:t>Zapisz zrzut z poleceniem i komunikatem Query complete. Nie uruchamiaj DROP przed ukończeniem backupu.</w:t>
-      </w:r>
-    </w:p>
-    <w:p>
-      <w:pPr>
-        <w:keepNext/>
-      </w:pPr>
-      <w:r>
-        <w:rPr>
-          <w:b/>
-        </w:rPr>
-        <w:t xml:space="preserve">Zrzut 2. </w:t>
-      </w:r>
-      <w:r>
-        <w:t>Wykonanie DROP TABLE</w:t>
+        <w:t>4 Restore zakończony — do wstawienia</w:t>
       </w:r>
     </w:p>
     <w:p>
       <w:r>
-        <w:rPr>
-          <w:i/>
-        </w:rPr>
-        <w:t>[Miejsce na zrzut z pgAdmin po wykonaniu tej czynności. Na obrazie pokaż nazwę bazy, polecenie lub status oraz wynik.]</w:t>
+        <w:t>5 SELECT po restore — do wstawienia</w:t>
       </w:r>
     </w:p>
     <w:p>
@@ -227,175 +196,36 @@
         <w:pStyle w:val="Heading1"/>
       </w:pPr>
       <w:r>
-        <w:t>3 Potwierdzenie że tabela nie istnieje</w:t>
+        <w:t>Gdzie trzymać kopię</w:t>
       </w:r>
     </w:p>
     <w:p>
       <w:r>
-        <w:t>Odśwież Tables w Object Explorer. Powinny zostać users i tasks, bez comment. Dodatkowo wykonaj kontrolne zapytanie. Pusta wartość w kolumnie tabela_po_usunieciu oznacza, że PostgreSQL nie znajduje public.comment.</w:t>
-      </w:r>
-    </w:p>
-    <w:p>
-      <w:pPr>
-        <w:spacing w:before="60" w:after="160"/>
-        <w:ind w:left="288"/>
-      </w:pPr>
-      <w:r>
-        <w:rPr>
-          <w:rFonts w:ascii="Consolas" w:hAnsi="Consolas"/>
-          <w:sz w:val="19"/>
-        </w:rPr>
-        <w:t>SELECT to_regclass('public.comment') AS tabela_po_usunieciu;</w:t>
-      </w:r>
-    </w:p>
-    <w:p>
-      <w:pPr>
-        <w:keepNext/>
-      </w:pPr>
-      <w:r>
-        <w:rPr>
-          <w:b/>
-        </w:rPr>
-        <w:t xml:space="preserve">Zrzut 3. </w:t>
-      </w:r>
-      <w:r>
-        <w:t>Brak tabeli po usunięciu</w:t>
+        <w:t>Plik ćwiczeniowy jest na D:. Sprawdź, czy D: jest osobnym dyskiem fizycznym; do bezpiecznego przechowywania użyj dysku zewnętrznego lub serwera.</w:t>
       </w:r>
     </w:p>
     <w:p>
       <w:r>
         <w:rPr>
-          <w:i/>
+          <w:b/>
         </w:rPr>
-        <w:t>[Miejsce na zrzut z pgAdmin po wykonaniu tej czynności. Na obrazie pokaż nazwę bazy, polecenie lub status oraz wynik.]</w:t>
-      </w:r>
-    </w:p>
-    <w:p>
-      <w:pPr>
-        <w:pStyle w:val="Heading1"/>
-      </w:pPr>
-      <w:r>
-        <w:t>4 Odtworzenie z kopii</w:t>
+        <w:t>Moje własne wyjaśnienie dlaczego ten sam dysk to zły pomysł (2–3 zdania):</w:t>
       </w:r>
     </w:p>
     <w:p>
       <w:r>
-        <w:t>Kliknij prawym przyciskiem bazę task_manager_2 i wybierz Restore. W General wybierz Format Custom i plik D:\task_manager_2_comment_2026-10-16.backup. Archiwum dotyczy tylko tabeli comment, więc istniejące users i tasks pozostają w bazie. Nie włączaj Only data ani Only schema; potrzebne są definicja i rekordy tabeli. Kliknij Restore, a na karcie Processes sprawdź Finished oraz Successfully completed.</w:t>
-      </w:r>
-    </w:p>
-    <w:p>
-      <w:pPr>
-        <w:keepNext/>
-      </w:pPr>
-      <w:r>
-        <w:rPr>
-          <w:b/>
-        </w:rPr>
-        <w:t xml:space="preserve">Zrzut 4. </w:t>
-      </w:r>
-      <w:r>
-        <w:t>Ukończony restore</w:t>
+        <w:t>................................................................................................</w:t>
       </w:r>
     </w:p>
     <w:p>
       <w:r>
-        <w:rPr>
-          <w:i/>
-        </w:rPr>
-        <w:t>[Miejsce na zrzut z pgAdmin po wykonaniu tej czynności. Na obrazie pokaż nazwę bazy, polecenie lub status oraz wynik.]</w:t>
-      </w:r>
-    </w:p>
-    <w:p>
-      <w:pPr>
-        <w:pStyle w:val="Heading1"/>
-      </w:pPr>
-      <w:r>
-        <w:t>5 Sprawdzenie danych po odtworzeniu</w:t>
-      </w:r>
-    </w:p>
-    <w:p>
-      <w:r>
-        <w:t>Odśwież Tables i upewnij się, że comment wróciła. W Query Tool wykonaj SELECT. Powinny być widoczne rekordy zapisane w kopii; w obecnym zestawie testowym oczekiwanych jest pięć wierszy.</w:t>
-      </w:r>
-    </w:p>
-    <w:p>
-      <w:pPr>
-        <w:spacing w:before="60" w:after="160"/>
-        <w:ind w:left="288"/>
-      </w:pPr>
-      <w:r>
-        <w:rPr>
-          <w:rFonts w:ascii="Consolas" w:hAnsi="Consolas"/>
-          <w:sz w:val="19"/>
-        </w:rPr>
-        <w:t>SELECT id, content, task_id, user_id</w:t>
-        <w:br/>
-      </w:r>
-      <w:r>
-        <w:rPr>
-          <w:rFonts w:ascii="Consolas" w:hAnsi="Consolas"/>
-          <w:sz w:val="19"/>
-        </w:rPr>
-        <w:t>FROM public.comment</w:t>
-        <w:br/>
-      </w:r>
-      <w:r>
-        <w:rPr>
-          <w:rFonts w:ascii="Consolas" w:hAnsi="Consolas"/>
-          <w:sz w:val="19"/>
-        </w:rPr>
-        <w:t>ORDER BY id;</w:t>
-      </w:r>
-    </w:p>
-    <w:p>
-      <w:pPr>
-        <w:keepNext/>
-      </w:pPr>
-      <w:r>
-        <w:rPr>
-          <w:b/>
-        </w:rPr>
-        <w:t xml:space="preserve">Zrzut 5. </w:t>
-      </w:r>
-      <w:r>
-        <w:t>SELECT po odtworzeniu tabeli</w:t>
-      </w:r>
-    </w:p>
-    <w:p>
-      <w:r>
-        <w:rPr>
-          <w:i/>
-        </w:rPr>
-        <w:t>[Miejsce na zrzut z pgAdmin po wykonaniu tej czynności. Na obrazie pokaż nazwę bazy, polecenie lub status oraz wynik.]</w:t>
-      </w:r>
-    </w:p>
-    <w:p>
-      <w:pPr>
-        <w:pStyle w:val="Heading1"/>
-      </w:pPr>
-      <w:r>
-        <w:t>Źródła</w:t>
-      </w:r>
-    </w:p>
-    <w:p>
-      <w:r>
-        <w:t>pgAdmin 4, Backup Dialog: https://www.pgadmin.org/docs/pgadmin4/latest/backup_dialog.html</w:t>
-      </w:r>
-    </w:p>
-    <w:p>
-      <w:r>
-        <w:t>pgAdmin 4, Restore Dialog: https://www.pgadmin.org/docs/pgadmin4/latest/restore_dialog.html</w:t>
-      </w:r>
-    </w:p>
-    <w:p>
-      <w:r>
-        <w:t>Materiał z polecenia: https://www.c-sharpcorner.com/article/postgresql-database-backup-and-restore-using-pgadmin</w:t>
+        <w:t>................................................................................................</w:t>
       </w:r>
     </w:p>
     <w:sectPr>
       <w:footerReference w:type="default" r:id="rId10"/>
       <w:pgSz w:w="12240" w:h="15840"/>
-      <w:pgMar w:top="1037" w:right="1123" w:bottom="936" w:left="1123" w:header="720" w:footer="720" w:gutter="0"/>
+      <w:pgMar w:top="893" w:right="1037" w:bottom="835" w:left="1037" w:header="720" w:footer="720" w:gutter="0"/>
       <w:cols w:space="720"/>
       <w:docGrid w:linePitch="360"/>
     </w:sectPr>
@@ -781,12 +611,12 @@
     <w:qFormat/>
     <w:rsid w:val="00FC693F"/>
     <w:pPr>
-      <w:spacing w:after="140" w:line="276" w:lineRule="auto"/>
+      <w:spacing w:after="80" w:line="259" w:lineRule="auto"/>
     </w:pPr>
     <w:rPr>
       <w:rFonts w:ascii="Aptos" w:hAnsi="Aptos"/>
-      <w:color w:val="161616"/>
-      <w:sz w:val="21"/>
+      <w:color w:val="141414"/>
+      <w:sz w:val="20"/>
     </w:rPr>
   </w:style>
   <w:style w:type="paragraph" w:styleId="Header">
@@ -844,7 +674,7 @@
     <w:pPr>
       <w:keepNext/>
       <w:keepLines/>
-      <w:spacing w:before="320" w:after="120"/>
+      <w:spacing w:before="160" w:after="60"/>
       <w:outlineLvl w:val="0"/>
     </w:pPr>
     <w:rPr>
@@ -852,7 +682,7 @@
       <w:b/>
       <w:bCs/>
       <w:color w:val="000000"/>
-      <w:sz w:val="26"/>
+      <w:sz w:val="22"/>
       <w:szCs w:val="28"/>
     </w:rPr>
   </w:style>
@@ -868,15 +698,15 @@
     <w:pPr>
       <w:keepNext/>
       <w:keepLines/>
-      <w:spacing w:before="200" w:after="80"/>
+      <w:spacing w:before="200" w:after="0"/>
       <w:outlineLvl w:val="1"/>
     </w:pPr>
     <w:rPr>
-      <w:rFonts w:asciiTheme="majorHAnsi" w:eastAsiaTheme="majorEastAsia" w:hAnsiTheme="majorHAnsi" w:cstheme="majorBidi" w:ascii="Aptos" w:hAnsi="Aptos"/>
+      <w:rFonts w:asciiTheme="majorHAnsi" w:eastAsiaTheme="majorEastAsia" w:hAnsiTheme="majorHAnsi" w:cstheme="majorBidi"/>
       <w:b/>
       <w:bCs/>
-      <w:color w:val="000000"/>
-      <w:sz w:val="22"/>
+      <w:color w:val="4F81BD" w:themeColor="accent1"/>
+      <w:sz w:val="26"/>
       <w:szCs w:val="26"/>
     </w:rPr>
   </w:style>
@@ -1134,7 +964,7 @@
       <w:pBdr>
         <w:bottom w:val="single" w:sz="8" w:space="4" w:color="4F81BD" w:themeColor="accent1"/>
       </w:pBdr>
-      <w:spacing w:after="220" w:line="240" w:lineRule="auto" w:before="0"/>
+      <w:spacing w:after="60" w:line="240" w:lineRule="auto" w:before="160"/>
       <w:contextualSpacing/>
     </w:pPr>
     <w:rPr>
@@ -1143,7 +973,7 @@
       <w:color w:val="000000"/>
       <w:spacing w:val="5"/>
       <w:kern w:val="28"/>
-      <w:sz w:val="38"/>
+      <w:sz w:val="34"/>
       <w:szCs w:val="52"/>
     </w:rPr>
   </w:style>

</xml_diff>

<commit_message>
Make pgAdmin backup guide plain and unstyled
</commit_message>
<xml_diff>
--- a/docs/backup-restore-pgadmin.docx
+++ b/docs/backup-restore-pgadmin.docx
@@ -3,143 +3,50 @@
 <w:document xmlns:wpc="http://schemas.microsoft.com/office/word/2010/wordprocessingCanvas" xmlns:mo="http://schemas.microsoft.com/office/mac/office/2008/main" xmlns:mc="http://schemas.openxmlformats.org/markup-compatibility/2006" xmlns:mv="urn:schemas-microsoft-com:mac:vml" xmlns:o="urn:schemas-microsoft-com:office:office" xmlns:r="http://schemas.openxmlformats.org/officeDocument/2006/relationships" xmlns:m="http://schemas.openxmlformats.org/officeDocument/2006/math" xmlns:v="urn:schemas-microsoft-com:vml" xmlns:wp14="http://schemas.microsoft.com/office/word/2010/wordprocessingDrawing" xmlns:wp="http://schemas.openxmlformats.org/drawingml/2006/wordprocessingDrawing" xmlns:w10="urn:schemas-microsoft-com:office:word" xmlns:w="http://schemas.openxmlformats.org/wordprocessingml/2006/main" xmlns:w14="http://schemas.microsoft.com/office/word/2010/wordml" xmlns:wpg="http://schemas.microsoft.com/office/word/2010/wordprocessingGroup" xmlns:wpi="http://schemas.microsoft.com/office/word/2010/wordprocessingInk" xmlns:wne="http://schemas.microsoft.com/office/word/2006/wordml" xmlns:wps="http://schemas.microsoft.com/office/word/2010/wordprocessingShape" mc:Ignorable="w14 wp14">
   <w:body>
     <w:p>
-      <w:pPr>
-        <w:pStyle w:val="Title"/>
-      </w:pPr>
       <w:r>
-        <w:t>Kopia zapasowa i odtwarzanie tabeli w pgAdmin</w:t>
+        <w:t>Kopia zapasowa i przywracanie tabeli comment w pgAdmin</w:t>
       </w:r>
     </w:p>
     <w:p>
       <w:r>
-        <w:t>Baza testowa: task_manager_2. Tabela: public.comment. Backup jest wykonany; usuwanie i odtwarzanie pozostają do wykonania.</w:t>
-      </w:r>
-    </w:p>
-    <w:p>
-      <w:pPr>
-        <w:pStyle w:val="Heading1"/>
-      </w:pPr>
-      <w:r>
-        <w:t>1 Backup</w:t>
+        <w:t>Baza: task_manager_2. Backup został wykonany. DROP i Restore nie były wykonywane.</w:t>
       </w:r>
     </w:p>
     <w:p>
       <w:r>
-        <w:t>Kliknij prawym przyciskiem comment → Backup. Format: Custom. Filename: D:\task_manager_2_comment_2026-10-16.backup. Kliknij Backup i sprawdź w Processes status Finished.</w:t>
-      </w:r>
-    </w:p>
-    <w:p>
-      <w:pPr>
-        <w:pStyle w:val="Heading1"/>
-      </w:pPr>
-      <w:r>
-        <w:t>2 Usuń tabelę</w:t>
+        <w:t>1. Backup: prawy przycisk na public.comment → Backup. Format: Custom. Plik: D:\task_manager_2_comment_2026-10-16.backup. Kliknij Backup i sprawdź status Finished.</w:t>
       </w:r>
     </w:p>
     <w:p>
       <w:r>
-        <w:t>Dopiero po sprawdzeniu kopii wykonaj w Query Tool:</w:t>
-      </w:r>
-    </w:p>
-    <w:p>
-      <w:pPr>
-        <w:ind w:left="288"/>
-      </w:pPr>
-      <w:r>
-        <w:rPr>
-          <w:rFonts w:ascii="Consolas" w:hAnsi="Consolas"/>
-          <w:sz w:val="18"/>
-        </w:rPr>
-        <w:t>DROP TABLE public.comment;</w:t>
-      </w:r>
-    </w:p>
-    <w:p>
-      <w:pPr>
-        <w:pStyle w:val="Heading1"/>
-      </w:pPr>
-      <w:r>
-        <w:t>3 Sprawdź brak tabeli</w:t>
+        <w:t>2. Usuń tabelę po sprawdzeniu kopii. W Query Tool wykonaj: DROP TABLE public.comment;</w:t>
       </w:r>
     </w:p>
     <w:p>
       <w:r>
-        <w:t>Odśwież public → Tables. Tabela comment powinna zniknąć. Możesz potwierdzić to zapytaniem:</w:t>
-      </w:r>
-    </w:p>
-    <w:p>
-      <w:pPr>
-        <w:ind w:left="288"/>
-      </w:pPr>
-      <w:r>
-        <w:rPr>
-          <w:rFonts w:ascii="Consolas" w:hAnsi="Consolas"/>
-          <w:sz w:val="18"/>
-        </w:rPr>
-        <w:t>SELECT to_regclass('public.comment') AS tabela;</w:t>
-      </w:r>
-    </w:p>
-    <w:p>
-      <w:pPr>
-        <w:pStyle w:val="Heading1"/>
-      </w:pPr>
-      <w:r>
-        <w:t>4 Restore</w:t>
+        <w:t>3. Odśwież Tables i sprawdź, że comment zniknęła. Możesz też wykonać: SELECT to_regclass('public.comment') AS tabela;</w:t>
       </w:r>
     </w:p>
     <w:p>
       <w:r>
-        <w:t>Kliknij prawym przyciskiem bazę task_manager_2 → Restore. Wybierz plik backup, format Custom i kliknij Restore. W Processes sprawdź Finished.</w:t>
-      </w:r>
-    </w:p>
-    <w:p>
-      <w:pPr>
-        <w:pStyle w:val="Heading1"/>
-      </w:pPr>
-      <w:r>
-        <w:t>5 Sprawdź dane</w:t>
+        <w:t>4. Restore: prawy przycisk na bazie task_manager_2 → Restore. Wybierz plik kopii, format Custom i kliknij Restore. Sprawdź status Finished.</w:t>
       </w:r>
     </w:p>
     <w:p>
       <w:r>
-        <w:t>Po odświeżeniu Tables wykonaj:</w:t>
-      </w:r>
-    </w:p>
-    <w:p>
-      <w:pPr>
-        <w:ind w:left="288"/>
-      </w:pPr>
-      <w:r>
-        <w:rPr>
-          <w:rFonts w:ascii="Consolas" w:hAnsi="Consolas"/>
-          <w:sz w:val="18"/>
-        </w:rPr>
-        <w:t>SELECT id, content, task_id, user_id FROM public.comment ORDER BY id;</w:t>
-      </w:r>
-    </w:p>
-    <w:p>
-      <w:pPr>
-        <w:pStyle w:val="Heading1"/>
-      </w:pPr>
-      <w:r>
-        <w:t>Zrzuty ekranu</w:t>
+        <w:t>5. Sprawdź odzyskane dane: SELECT id, content, task_id, user_id FROM public.comment ORDER BY id;</w:t>
       </w:r>
     </w:p>
     <w:p>
       <w:r>
-        <w:rPr>
-          <w:b/>
-        </w:rPr>
-        <w:t>1 Backup zakończony</w:t>
+        <w:t>Zrzut 1: wykonany backup</w:t>
       </w:r>
     </w:p>
     <w:p>
-      <w:pPr>
-        <w:spacing w:after="100"/>
-      </w:pPr>
       <w:r>
         <w:drawing>
           <wp:inline xmlns:a="http://schemas.openxmlformats.org/drawingml/2006/main" xmlns:pic="http://schemas.openxmlformats.org/drawingml/2006/picture">
-            <wp:extent cx="5394960" cy="2868320"/>
+            <wp:extent cx="5029200" cy="2673858"/>
             <wp:docPr id="1" name="Picture 1"/>
             <wp:cNvGraphicFramePr>
               <a:graphicFrameLocks noChangeAspect="1"/>
@@ -160,7 +67,7 @@
                   <pic:spPr>
                     <a:xfrm>
                       <a:off x="0" y="0"/>
-                      <a:ext cx="5394960" cy="2868320"/>
+                      <a:ext cx="5029200" cy="2673858"/>
                     </a:xfrm>
                     <a:prstGeom prst="rect"/>
                   </pic:spPr>
@@ -173,78 +80,37 @@
     </w:p>
     <w:p>
       <w:r>
-        <w:t>2 DROP TABLE — do wstawienia</w:t>
+        <w:t>Zrzuty 2–5 do wstawienia po wykonaniu: DROP TABLE, brak tabeli, Restore, SELECT po Restore.</w:t>
       </w:r>
     </w:p>
     <w:p>
       <w:r>
-        <w:t>3 Brak tabeli — do wstawienia</w:t>
+        <w:t>Kopię najlepiej trzymać na zewnętrznym dysku lub serwerze. Sprawdź, czy D: nie jest tylko partycją tego samego dysku.</w:t>
       </w:r>
     </w:p>
     <w:p>
       <w:r>
-        <w:t>4 Restore zakończony — do wstawienia</w:t>
+        <w:t>Moje własne wyjaśnienie dlaczego kopia na tym samym dysku to zły pomysł:</w:t>
       </w:r>
     </w:p>
     <w:p>
       <w:r>
-        <w:t>5 SELECT po restore — do wstawienia</w:t>
-      </w:r>
-    </w:p>
-    <w:p>
-      <w:pPr>
-        <w:pStyle w:val="Heading1"/>
-      </w:pPr>
-      <w:r>
-        <w:t>Gdzie trzymać kopię</w:t>
+        <w:t>........................................................................................</w:t>
       </w:r>
     </w:p>
     <w:p>
       <w:r>
-        <w:t>Plik ćwiczeniowy jest na D:. Sprawdź, czy D: jest osobnym dyskiem fizycznym; do bezpiecznego przechowywania użyj dysku zewnętrznego lub serwera.</w:t>
-      </w:r>
-    </w:p>
-    <w:p>
-      <w:r>
-        <w:rPr>
-          <w:b/>
-        </w:rPr>
-        <w:t>Moje własne wyjaśnienie dlaczego ten sam dysk to zły pomysł (2–3 zdania):</w:t>
-      </w:r>
-    </w:p>
-    <w:p>
-      <w:r>
-        <w:t>................................................................................................</w:t>
-      </w:r>
-    </w:p>
-    <w:p>
-      <w:r>
-        <w:t>................................................................................................</w:t>
+        <w:t>........................................................................................</w:t>
       </w:r>
     </w:p>
     <w:sectPr>
-      <w:footerReference w:type="default" r:id="rId10"/>
       <w:pgSz w:w="12240" w:h="15840"/>
-      <w:pgMar w:top="893" w:right="1037" w:bottom="835" w:left="1037" w:header="720" w:footer="720" w:gutter="0"/>
+      <w:pgMar w:top="1440" w:right="1800" w:bottom="1440" w:left="1800" w:header="720" w:footer="720" w:gutter="0"/>
       <w:cols w:space="720"/>
       <w:docGrid w:linePitch="360"/>
     </w:sectPr>
   </w:body>
 </w:document>
-</file>
-
-<file path=word/footer1.xml><?xml version="1.0" encoding="utf-8"?>
-<w:ftr xmlns:m="http://schemas.openxmlformats.org/officeDocument/2006/math" xmlns:mc="http://schemas.openxmlformats.org/markup-compatibility/2006" xmlns:mo="http://schemas.microsoft.com/office/mac/office/2008/main" xmlns:mv="urn:schemas-microsoft-com:mac:vml" xmlns:o="urn:schemas-microsoft-com:office:office" xmlns:r="http://schemas.openxmlformats.org/officeDocument/2006/relationships" xmlns:v="urn:schemas-microsoft-com:vml" xmlns:w10="urn:schemas-microsoft-com:office:word" xmlns:w14="http://schemas.microsoft.com/office/word/2010/wordml" xmlns:w="http://schemas.openxmlformats.org/wordprocessingml/2006/main" xmlns:wne="http://schemas.microsoft.com/office/word/2006/wordml" xmlns:wp14="http://schemas.microsoft.com/office/word/2010/wordprocessingDrawing" xmlns:wp="http://schemas.openxmlformats.org/drawingml/2006/wordprocessingDrawing" xmlns:wpc="http://schemas.microsoft.com/office/word/2010/wordprocessingCanvas" xmlns:wpg="http://schemas.microsoft.com/office/word/2010/wordprocessingGroup" xmlns:wpi="http://schemas.microsoft.com/office/word/2010/wordprocessingInk" xmlns:wps="http://schemas.microsoft.com/office/word/2010/wordprocessingShape" mc:Ignorable="w14 wp14">
-  <w:p>
-    <w:pPr>
-      <w:pStyle w:val="Footer"/>
-      <w:jc w:val="right"/>
-    </w:pPr>
-    <w:r>
-      <w:t>task_manager_2  •  pgAdmin 4</w:t>
-    </w:r>
-  </w:p>
-</w:ftr>
 </file>
 
 <file path=word/numbering.xml><?xml version="1.0" encoding="utf-8"?>
@@ -610,14 +476,6 @@
     <w:name w:val="Normal"/>
     <w:qFormat/>
     <w:rsid w:val="00FC693F"/>
-    <w:pPr>
-      <w:spacing w:after="80" w:line="259" w:lineRule="auto"/>
-    </w:pPr>
-    <w:rPr>
-      <w:rFonts w:ascii="Aptos" w:hAnsi="Aptos"/>
-      <w:color w:val="141414"/>
-      <w:sz w:val="20"/>
-    </w:rPr>
   </w:style>
   <w:style w:type="paragraph" w:styleId="Header">
     <w:name w:val="header"/>
@@ -674,15 +532,15 @@
     <w:pPr>
       <w:keepNext/>
       <w:keepLines/>
-      <w:spacing w:before="160" w:after="60"/>
+      <w:spacing w:before="480" w:after="0"/>
       <w:outlineLvl w:val="0"/>
     </w:pPr>
     <w:rPr>
-      <w:rFonts w:asciiTheme="majorHAnsi" w:eastAsiaTheme="majorEastAsia" w:hAnsiTheme="majorHAnsi" w:cstheme="majorBidi" w:ascii="Aptos" w:hAnsi="Aptos"/>
+      <w:rFonts w:asciiTheme="majorHAnsi" w:eastAsiaTheme="majorEastAsia" w:hAnsiTheme="majorHAnsi" w:cstheme="majorBidi"/>
       <w:b/>
       <w:bCs/>
-      <w:color w:val="000000"/>
-      <w:sz w:val="22"/>
+      <w:color w:val="365F91" w:themeColor="accent1" w:themeShade="BF"/>
+      <w:sz w:val="28"/>
       <w:szCs w:val="28"/>
     </w:rPr>
   </w:style>
@@ -960,20 +818,18 @@
     <w:qFormat/>
     <w:rsid w:val="00FC693F"/>
     <w:pPr>
-      <w:keepNext/>
       <w:pBdr>
         <w:bottom w:val="single" w:sz="8" w:space="4" w:color="4F81BD" w:themeColor="accent1"/>
       </w:pBdr>
-      <w:spacing w:after="60" w:line="240" w:lineRule="auto" w:before="160"/>
+      <w:spacing w:after="300" w:line="240" w:lineRule="auto"/>
       <w:contextualSpacing/>
     </w:pPr>
     <w:rPr>
-      <w:rFonts w:asciiTheme="majorHAnsi" w:eastAsiaTheme="majorEastAsia" w:hAnsiTheme="majorHAnsi" w:cstheme="majorBidi" w:ascii="Aptos" w:hAnsi="Aptos"/>
-      <w:b/>
-      <w:color w:val="000000"/>
+      <w:rFonts w:asciiTheme="majorHAnsi" w:eastAsiaTheme="majorEastAsia" w:hAnsiTheme="majorHAnsi" w:cstheme="majorBidi"/>
+      <w:color w:val="17365D" w:themeColor="text2" w:themeShade="BF"/>
       <w:spacing w:val="5"/>
       <w:kern w:val="28"/>
-      <w:sz w:val="34"/>
+      <w:sz w:val="52"/>
       <w:szCs w:val="52"/>
     </w:rPr>
   </w:style>

</xml_diff>

<commit_message>
Remove unfinished notes from backup guide
</commit_message>
<xml_diff>
--- a/docs/backup-restore-pgadmin.docx
+++ b/docs/backup-restore-pgadmin.docx
@@ -76,31 +76,6 @@
             </a:graphic>
           </wp:inline>
         </w:drawing>
-      </w:r>
-    </w:p>
-    <w:p>
-      <w:r>
-        <w:t>Zrzuty 2–5 do wstawienia po wykonaniu: DROP TABLE, brak tabeli, Restore, SELECT po Restore.</w:t>
-      </w:r>
-    </w:p>
-    <w:p>
-      <w:r>
-        <w:t>Kopię najlepiej trzymać na zewnętrznym dysku lub serwerze. Sprawdź, czy D: nie jest tylko partycją tego samego dysku.</w:t>
-      </w:r>
-    </w:p>
-    <w:p>
-      <w:r>
-        <w:t>Moje własne wyjaśnienie dlaczego kopia na tym samym dysku to zły pomysł:</w:t>
-      </w:r>
-    </w:p>
-    <w:p>
-      <w:r>
-        <w:t>........................................................................................</w:t>
-      </w:r>
-    </w:p>
-    <w:p>
-      <w:r>
-        <w:t>........................................................................................</w:t>
       </w:r>
     </w:p>
     <w:sectPr>

</xml_diff>

<commit_message>
Document pgAdmin backup and restore test
</commit_message>
<xml_diff>
--- a/docs/backup-restore-pgadmin.docx
+++ b/docs/backup-restore-pgadmin.docx
@@ -4,49 +4,65 @@
   <w:body>
     <w:p>
       <w:r>
+        <w:rPr>
+          <w:b/>
+        </w:rPr>
         <w:t>Kopia zapasowa i przywracanie tabeli comment w pgAdmin</w:t>
       </w:r>
     </w:p>
     <w:p>
       <w:r>
-        <w:t>Baza: task_manager_2. Backup został wykonany. DROP i Restore nie były wykonywane.</w:t>
+        <w:t>Test wykonany 27.10.2026 w osobnej bazie task_manager_backup_demo_20261027. Baza task_manager_2 nie była zmieniana.</w:t>
       </w:r>
     </w:p>
     <w:p>
       <w:r>
-        <w:t>1. Backup: prawy przycisk na public.comment → Backup. Format: Custom. Plik: D:\task_manager_2_comment_2026-10-16.backup. Kliknij Backup i sprawdź status Finished.</w:t>
+        <w:t>1. W pgAdmin kliknij prawym przyciskiem public.comment i wybierz Backup. Ustaw format Custom, podaj nazwę pliku i kliknij Backup. Sprawdź status Finished.</w:t>
       </w:r>
     </w:p>
     <w:p>
       <w:r>
-        <w:t>2. Usuń tabelę po sprawdzeniu kopii. W Query Tool wykonaj: DROP TABLE public.comment;</w:t>
+        <w:t>2. Po sprawdzeniu kopii kliknij prawym przyciskiem public.comment, wybierz Drop i potwierdź. To odpowiada poleceniu DROP TABLE public.comment;</w:t>
       </w:r>
     </w:p>
     <w:p>
       <w:r>
-        <w:t>3. Odśwież Tables i sprawdź, że comment zniknęła. Możesz też wykonać: SELECT to_regclass('public.comment') AS tabela;</w:t>
+        <w:t>3. W Schemas → public → Tables sprawdź, że zostały tylko tasks i users.</w:t>
       </w:r>
     </w:p>
     <w:p>
       <w:r>
-        <w:t>4. Restore: prawy przycisk na bazie task_manager_2 → Restore. Wybierz plik kopii, format Custom i kliknij Restore. Sprawdź status Finished.</w:t>
+        <w:t>4. Kliknij prawym przyciskiem bazę testową, wybierz Restore, wskaż ten sam plik Custom i sprawdź status Finished.</w:t>
       </w:r>
     </w:p>
     <w:p>
       <w:r>
-        <w:t>5. Sprawdź odzyskane dane: SELECT id, content, task_id, user_id FROM public.comment ORDER BY id;</w:t>
+        <w:t>5. W Query Tool wykonaj: SELECT id, content, task_id, user_id FROM public.comment ORDER BY id; Wynik: 5 przywróconych rekordów.</w:t>
       </w:r>
     </w:p>
     <w:p>
       <w:r>
-        <w:t>Zrzut 1: wykonany backup</w:t>
+        <w:t>Plik testowy zapisano w backup-demo/comment-pgadmin.backup, poza repozytorium GitHub. Do prawdziwego backupu wybrałbym drugi dysk lub serwer. Jeśli zepsuje się dysk z bazą, kopia na tym samym dysku może zniknąć razem z nią.</w:t>
+      </w:r>
+    </w:p>
+    <w:p>
+      <w:r>
+        <w:br w:type="page"/>
+      </w:r>
+    </w:p>
+    <w:p>
+      <w:r>
+        <w:rPr>
+          <w:b/>
+        </w:rPr>
+        <w:t>1. Backup zakończony — status Finished</w:t>
       </w:r>
     </w:p>
     <w:p>
       <w:r>
         <w:drawing>
           <wp:inline xmlns:a="http://schemas.openxmlformats.org/drawingml/2006/main" xmlns:pic="http://schemas.openxmlformats.org/drawingml/2006/picture">
-            <wp:extent cx="5029200" cy="2673858"/>
+            <wp:extent cx="9612000" cy="5106375"/>
             <wp:docPr id="1" name="Picture 1"/>
             <wp:cNvGraphicFramePr>
               <a:graphicFrameLocks noChangeAspect="1"/>
@@ -55,7 +71,7 @@
               <a:graphicData uri="http://schemas.openxmlformats.org/drawingml/2006/picture">
                 <pic:pic>
                   <pic:nvPicPr>
-                    <pic:cNvPr id="0" name="backup-small.jpg"/>
+                    <pic:cNvPr id="0" name="backup-demo-finished.jpg"/>
                     <pic:cNvPicPr/>
                   </pic:nvPicPr>
                   <pic:blipFill>
@@ -67,7 +83,203 @@
                   <pic:spPr>
                     <a:xfrm>
                       <a:off x="0" y="0"/>
-                      <a:ext cx="5029200" cy="2673858"/>
+                      <a:ext cx="9612000" cy="5106375"/>
+                    </a:xfrm>
+                    <a:prstGeom prst="rect"/>
+                  </pic:spPr>
+                </pic:pic>
+              </a:graphicData>
+            </a:graphic>
+          </wp:inline>
+        </w:drawing>
+      </w:r>
+    </w:p>
+    <w:p>
+      <w:r>
+        <w:br w:type="page"/>
+      </w:r>
+    </w:p>
+    <w:p>
+      <w:r>
+        <w:rPr>
+          <w:b/>
+        </w:rPr>
+        <w:t>2. Potwierdzenie usunięcia tabeli comment</w:t>
+      </w:r>
+    </w:p>
+    <w:p>
+      <w:r>
+        <w:drawing>
+          <wp:inline xmlns:a="http://schemas.openxmlformats.org/drawingml/2006/main" xmlns:pic="http://schemas.openxmlformats.org/drawingml/2006/picture">
+            <wp:extent cx="7870694" cy="5940000"/>
+            <wp:docPr id="2" name="Picture 2"/>
+            <wp:cNvGraphicFramePr>
+              <a:graphicFrameLocks noChangeAspect="1"/>
+            </wp:cNvGraphicFramePr>
+            <a:graphic>
+              <a:graphicData uri="http://schemas.openxmlformats.org/drawingml/2006/picture">
+                <pic:pic>
+                  <pic:nvPicPr>
+                    <pic:cNvPr id="0" name="backup-demo-drop-confirm.jpg"/>
+                    <pic:cNvPicPr/>
+                  </pic:nvPicPr>
+                  <pic:blipFill>
+                    <a:blip r:embed="rId10"/>
+                    <a:stretch>
+                      <a:fillRect/>
+                    </a:stretch>
+                  </pic:blipFill>
+                  <pic:spPr>
+                    <a:xfrm>
+                      <a:off x="0" y="0"/>
+                      <a:ext cx="7870694" cy="5940000"/>
+                    </a:xfrm>
+                    <a:prstGeom prst="rect"/>
+                  </pic:spPr>
+                </pic:pic>
+              </a:graphicData>
+            </a:graphic>
+          </wp:inline>
+        </w:drawing>
+      </w:r>
+    </w:p>
+    <w:p>
+      <w:r>
+        <w:br w:type="page"/>
+      </w:r>
+    </w:p>
+    <w:p>
+      <w:r>
+        <w:rPr>
+          <w:b/>
+        </w:rPr>
+        <w:t>3. Po usunięciu — w Tables są tylko dwie tabele</w:t>
+      </w:r>
+    </w:p>
+    <w:p>
+      <w:r>
+        <w:drawing>
+          <wp:inline xmlns:a="http://schemas.openxmlformats.org/drawingml/2006/main" xmlns:pic="http://schemas.openxmlformats.org/drawingml/2006/picture">
+            <wp:extent cx="7870694" cy="5940000"/>
+            <wp:docPr id="3" name="Picture 3"/>
+            <wp:cNvGraphicFramePr>
+              <a:graphicFrameLocks noChangeAspect="1"/>
+            </wp:cNvGraphicFramePr>
+            <a:graphic>
+              <a:graphicData uri="http://schemas.openxmlformats.org/drawingml/2006/picture">
+                <pic:pic>
+                  <pic:nvPicPr>
+                    <pic:cNvPr id="0" name="backup-demo-table-missing.jpg"/>
+                    <pic:cNvPicPr/>
+                  </pic:nvPicPr>
+                  <pic:blipFill>
+                    <a:blip r:embed="rId11"/>
+                    <a:stretch>
+                      <a:fillRect/>
+                    </a:stretch>
+                  </pic:blipFill>
+                  <pic:spPr>
+                    <a:xfrm>
+                      <a:off x="0" y="0"/>
+                      <a:ext cx="7870694" cy="5940000"/>
+                    </a:xfrm>
+                    <a:prstGeom prst="rect"/>
+                  </pic:spPr>
+                </pic:pic>
+              </a:graphicData>
+            </a:graphic>
+          </wp:inline>
+        </w:drawing>
+      </w:r>
+    </w:p>
+    <w:p>
+      <w:r>
+        <w:br w:type="page"/>
+      </w:r>
+    </w:p>
+    <w:p>
+      <w:r>
+        <w:rPr>
+          <w:b/>
+        </w:rPr>
+        <w:t>4. Restore zakończony — status Finished</w:t>
+      </w:r>
+    </w:p>
+    <w:p>
+      <w:r>
+        <w:drawing>
+          <wp:inline xmlns:a="http://schemas.openxmlformats.org/drawingml/2006/main" xmlns:pic="http://schemas.openxmlformats.org/drawingml/2006/picture">
+            <wp:extent cx="9612000" cy="5106375"/>
+            <wp:docPr id="4" name="Picture 4"/>
+            <wp:cNvGraphicFramePr>
+              <a:graphicFrameLocks noChangeAspect="1"/>
+            </wp:cNvGraphicFramePr>
+            <a:graphic>
+              <a:graphicData uri="http://schemas.openxmlformats.org/drawingml/2006/picture">
+                <pic:pic>
+                  <pic:nvPicPr>
+                    <pic:cNvPr id="0" name="backup-demo-restore-finished.jpg"/>
+                    <pic:cNvPicPr/>
+                  </pic:nvPicPr>
+                  <pic:blipFill>
+                    <a:blip r:embed="rId12"/>
+                    <a:stretch>
+                      <a:fillRect/>
+                    </a:stretch>
+                  </pic:blipFill>
+                  <pic:spPr>
+                    <a:xfrm>
+                      <a:off x="0" y="0"/>
+                      <a:ext cx="9612000" cy="5106375"/>
+                    </a:xfrm>
+                    <a:prstGeom prst="rect"/>
+                  </pic:spPr>
+                </pic:pic>
+              </a:graphicData>
+            </a:graphic>
+          </wp:inline>
+        </w:drawing>
+      </w:r>
+    </w:p>
+    <w:p>
+      <w:r>
+        <w:br w:type="page"/>
+      </w:r>
+    </w:p>
+    <w:p>
+      <w:r>
+        <w:rPr>
+          <w:b/>
+        </w:rPr>
+        <w:t>5. SELECT po Restore — odzyskano pięć rekordów</w:t>
+      </w:r>
+    </w:p>
+    <w:p>
+      <w:r>
+        <w:drawing>
+          <wp:inline xmlns:a="http://schemas.openxmlformats.org/drawingml/2006/main" xmlns:pic="http://schemas.openxmlformats.org/drawingml/2006/picture">
+            <wp:extent cx="9612000" cy="5106375"/>
+            <wp:docPr id="5" name="Picture 5"/>
+            <wp:cNvGraphicFramePr>
+              <a:graphicFrameLocks noChangeAspect="1"/>
+            </wp:cNvGraphicFramePr>
+            <a:graphic>
+              <a:graphicData uri="http://schemas.openxmlformats.org/drawingml/2006/picture">
+                <pic:pic>
+                  <pic:nvPicPr>
+                    <pic:cNvPr id="0" name="backup-demo-restored-rows.jpg"/>
+                    <pic:cNvPicPr/>
+                  </pic:nvPicPr>
+                  <pic:blipFill>
+                    <a:blip r:embed="rId13"/>
+                    <a:stretch>
+                      <a:fillRect/>
+                    </a:stretch>
+                  </pic:blipFill>
+                  <pic:spPr>
+                    <a:xfrm>
+                      <a:off x="0" y="0"/>
+                      <a:ext cx="9612000" cy="5106375"/>
                     </a:xfrm>
                     <a:prstGeom prst="rect"/>
                   </pic:spPr>
@@ -79,8 +291,8 @@
       </w:r>
     </w:p>
     <w:sectPr>
-      <w:pgSz w:w="12240" w:h="15840"/>
-      <w:pgMar w:top="1440" w:right="1800" w:bottom="1440" w:left="1800" w:header="720" w:footer="720" w:gutter="0"/>
+      <w:pgSz w:w="16838" w:h="11906" w:orient="landscape"/>
+      <w:pgMar w:top="794" w:right="907" w:bottom="794" w:left="907" w:header="720" w:footer="720" w:gutter="0"/>
       <w:cols w:space="720"/>
       <w:docGrid w:linePitch="360"/>
     </w:sectPr>
@@ -451,6 +663,13 @@
     <w:name w:val="Normal"/>
     <w:qFormat/>
     <w:rsid w:val="00FC693F"/>
+    <w:pPr>
+      <w:spacing w:after="140"/>
+    </w:pPr>
+    <w:rPr>
+      <w:rFonts w:ascii="Calibri" w:hAnsi="Calibri"/>
+      <w:sz w:val="22"/>
+    </w:rPr>
   </w:style>
   <w:style w:type="paragraph" w:styleId="Header">
     <w:name w:val="header"/>

</xml_diff>

<commit_message>
Add pgAdmin backup and restore evidence
</commit_message>
<xml_diff>
--- a/docs/backup-restore-pgadmin.docx
+++ b/docs/backup-restore-pgadmin.docx
@@ -4,49 +4,65 @@
   <w:body>
     <w:p>
       <w:r>
+        <w:rPr>
+          <w:b/>
+        </w:rPr>
         <w:t>Kopia zapasowa i przywracanie tabeli comment w pgAdmin</w:t>
       </w:r>
     </w:p>
     <w:p>
       <w:r>
-        <w:t>Baza: task_manager_2. Backup został wykonany. DROP i Restore nie były wykonywane.</w:t>
+        <w:t>Test wykonany 27.10.2026 w osobnej bazie task_manager_backup_demo_20261027. Baza task_manager_2 nie była zmieniana.</w:t>
       </w:r>
     </w:p>
     <w:p>
       <w:r>
-        <w:t>1. Backup: prawy przycisk na public.comment → Backup. Format: Custom. Plik: D:\task_manager_2_comment_2026-10-16.backup. Kliknij Backup i sprawdź status Finished.</w:t>
+        <w:t>1. W pgAdmin kliknij prawym przyciskiem public.comment i wybierz Backup. Ustaw format Custom, podaj nazwę pliku i kliknij Backup. Sprawdź status Finished.</w:t>
       </w:r>
     </w:p>
     <w:p>
       <w:r>
-        <w:t>2. Usuń tabelę po sprawdzeniu kopii. W Query Tool wykonaj: DROP TABLE public.comment;</w:t>
+        <w:t>2. Po sprawdzeniu kopii kliknij prawym przyciskiem public.comment, wybierz Drop i potwierdź. To odpowiada poleceniu DROP TABLE public.comment;</w:t>
       </w:r>
     </w:p>
     <w:p>
       <w:r>
-        <w:t>3. Odśwież Tables i sprawdź, że comment zniknęła. Możesz też wykonać: SELECT to_regclass('public.comment') AS tabela;</w:t>
+        <w:t>3. W Schemas → public → Tables sprawdź, że zostały tylko tasks i users.</w:t>
       </w:r>
     </w:p>
     <w:p>
       <w:r>
-        <w:t>4. Restore: prawy przycisk na bazie task_manager_2 → Restore. Wybierz plik kopii, format Custom i kliknij Restore. Sprawdź status Finished.</w:t>
+        <w:t>4. Kliknij prawym przyciskiem bazę testową, wybierz Restore, wskaż ten sam plik Custom i sprawdź status Finished.</w:t>
       </w:r>
     </w:p>
     <w:p>
       <w:r>
-        <w:t>5. Sprawdź odzyskane dane: SELECT id, content, task_id, user_id FROM public.comment ORDER BY id;</w:t>
+        <w:t>5. W Query Tool wykonaj: SELECT id, content, task_id, user_id FROM public.comment ORDER BY id; Wynik: 5 przywróconych rekordów.</w:t>
       </w:r>
     </w:p>
     <w:p>
       <w:r>
-        <w:t>Zrzut 1: wykonany backup</w:t>
+        <w:t>Plik testowy zapisano w backup-demo/comment-pgadmin.backup, poza repozytorium GitHub. Do prawdziwego backupu wybrałbym drugi dysk lub serwer. Jeśli zepsuje się dysk z bazą, kopia na tym samym dysku może zniknąć razem z nią.</w:t>
+      </w:r>
+    </w:p>
+    <w:p>
+      <w:r>
+        <w:br w:type="page"/>
+      </w:r>
+    </w:p>
+    <w:p>
+      <w:r>
+        <w:rPr>
+          <w:b/>
+        </w:rPr>
+        <w:t>1. Backup zakończony — status Finished</w:t>
       </w:r>
     </w:p>
     <w:p>
       <w:r>
         <w:drawing>
           <wp:inline xmlns:a="http://schemas.openxmlformats.org/drawingml/2006/main" xmlns:pic="http://schemas.openxmlformats.org/drawingml/2006/picture">
-            <wp:extent cx="5029200" cy="2673858"/>
+            <wp:extent cx="9612000" cy="5106375"/>
             <wp:docPr id="1" name="Picture 1"/>
             <wp:cNvGraphicFramePr>
               <a:graphicFrameLocks noChangeAspect="1"/>
@@ -55,7 +71,7 @@
               <a:graphicData uri="http://schemas.openxmlformats.org/drawingml/2006/picture">
                 <pic:pic>
                   <pic:nvPicPr>
-                    <pic:cNvPr id="0" name="backup-small.jpg"/>
+                    <pic:cNvPr id="0" name="backup-demo-finished.jpg"/>
                     <pic:cNvPicPr/>
                   </pic:nvPicPr>
                   <pic:blipFill>
@@ -67,7 +83,203 @@
                   <pic:spPr>
                     <a:xfrm>
                       <a:off x="0" y="0"/>
-                      <a:ext cx="5029200" cy="2673858"/>
+                      <a:ext cx="9612000" cy="5106375"/>
+                    </a:xfrm>
+                    <a:prstGeom prst="rect"/>
+                  </pic:spPr>
+                </pic:pic>
+              </a:graphicData>
+            </a:graphic>
+          </wp:inline>
+        </w:drawing>
+      </w:r>
+    </w:p>
+    <w:p>
+      <w:r>
+        <w:br w:type="page"/>
+      </w:r>
+    </w:p>
+    <w:p>
+      <w:r>
+        <w:rPr>
+          <w:b/>
+        </w:rPr>
+        <w:t>2. Potwierdzenie usunięcia tabeli comment</w:t>
+      </w:r>
+    </w:p>
+    <w:p>
+      <w:r>
+        <w:drawing>
+          <wp:inline xmlns:a="http://schemas.openxmlformats.org/drawingml/2006/main" xmlns:pic="http://schemas.openxmlformats.org/drawingml/2006/picture">
+            <wp:extent cx="7870694" cy="5940000"/>
+            <wp:docPr id="2" name="Picture 2"/>
+            <wp:cNvGraphicFramePr>
+              <a:graphicFrameLocks noChangeAspect="1"/>
+            </wp:cNvGraphicFramePr>
+            <a:graphic>
+              <a:graphicData uri="http://schemas.openxmlformats.org/drawingml/2006/picture">
+                <pic:pic>
+                  <pic:nvPicPr>
+                    <pic:cNvPr id="0" name="backup-demo-drop-confirm.jpg"/>
+                    <pic:cNvPicPr/>
+                  </pic:nvPicPr>
+                  <pic:blipFill>
+                    <a:blip r:embed="rId10"/>
+                    <a:stretch>
+                      <a:fillRect/>
+                    </a:stretch>
+                  </pic:blipFill>
+                  <pic:spPr>
+                    <a:xfrm>
+                      <a:off x="0" y="0"/>
+                      <a:ext cx="7870694" cy="5940000"/>
+                    </a:xfrm>
+                    <a:prstGeom prst="rect"/>
+                  </pic:spPr>
+                </pic:pic>
+              </a:graphicData>
+            </a:graphic>
+          </wp:inline>
+        </w:drawing>
+      </w:r>
+    </w:p>
+    <w:p>
+      <w:r>
+        <w:br w:type="page"/>
+      </w:r>
+    </w:p>
+    <w:p>
+      <w:r>
+        <w:rPr>
+          <w:b/>
+        </w:rPr>
+        <w:t>3. Po usunięciu — w Tables są tylko dwie tabele</w:t>
+      </w:r>
+    </w:p>
+    <w:p>
+      <w:r>
+        <w:drawing>
+          <wp:inline xmlns:a="http://schemas.openxmlformats.org/drawingml/2006/main" xmlns:pic="http://schemas.openxmlformats.org/drawingml/2006/picture">
+            <wp:extent cx="7870694" cy="5940000"/>
+            <wp:docPr id="3" name="Picture 3"/>
+            <wp:cNvGraphicFramePr>
+              <a:graphicFrameLocks noChangeAspect="1"/>
+            </wp:cNvGraphicFramePr>
+            <a:graphic>
+              <a:graphicData uri="http://schemas.openxmlformats.org/drawingml/2006/picture">
+                <pic:pic>
+                  <pic:nvPicPr>
+                    <pic:cNvPr id="0" name="backup-demo-table-missing.jpg"/>
+                    <pic:cNvPicPr/>
+                  </pic:nvPicPr>
+                  <pic:blipFill>
+                    <a:blip r:embed="rId11"/>
+                    <a:stretch>
+                      <a:fillRect/>
+                    </a:stretch>
+                  </pic:blipFill>
+                  <pic:spPr>
+                    <a:xfrm>
+                      <a:off x="0" y="0"/>
+                      <a:ext cx="7870694" cy="5940000"/>
+                    </a:xfrm>
+                    <a:prstGeom prst="rect"/>
+                  </pic:spPr>
+                </pic:pic>
+              </a:graphicData>
+            </a:graphic>
+          </wp:inline>
+        </w:drawing>
+      </w:r>
+    </w:p>
+    <w:p>
+      <w:r>
+        <w:br w:type="page"/>
+      </w:r>
+    </w:p>
+    <w:p>
+      <w:r>
+        <w:rPr>
+          <w:b/>
+        </w:rPr>
+        <w:t>4. Restore zakończony — status Finished</w:t>
+      </w:r>
+    </w:p>
+    <w:p>
+      <w:r>
+        <w:drawing>
+          <wp:inline xmlns:a="http://schemas.openxmlformats.org/drawingml/2006/main" xmlns:pic="http://schemas.openxmlformats.org/drawingml/2006/picture">
+            <wp:extent cx="9612000" cy="5106375"/>
+            <wp:docPr id="4" name="Picture 4"/>
+            <wp:cNvGraphicFramePr>
+              <a:graphicFrameLocks noChangeAspect="1"/>
+            </wp:cNvGraphicFramePr>
+            <a:graphic>
+              <a:graphicData uri="http://schemas.openxmlformats.org/drawingml/2006/picture">
+                <pic:pic>
+                  <pic:nvPicPr>
+                    <pic:cNvPr id="0" name="backup-demo-restore-finished.jpg"/>
+                    <pic:cNvPicPr/>
+                  </pic:nvPicPr>
+                  <pic:blipFill>
+                    <a:blip r:embed="rId12"/>
+                    <a:stretch>
+                      <a:fillRect/>
+                    </a:stretch>
+                  </pic:blipFill>
+                  <pic:spPr>
+                    <a:xfrm>
+                      <a:off x="0" y="0"/>
+                      <a:ext cx="9612000" cy="5106375"/>
+                    </a:xfrm>
+                    <a:prstGeom prst="rect"/>
+                  </pic:spPr>
+                </pic:pic>
+              </a:graphicData>
+            </a:graphic>
+          </wp:inline>
+        </w:drawing>
+      </w:r>
+    </w:p>
+    <w:p>
+      <w:r>
+        <w:br w:type="page"/>
+      </w:r>
+    </w:p>
+    <w:p>
+      <w:r>
+        <w:rPr>
+          <w:b/>
+        </w:rPr>
+        <w:t>5. SELECT po Restore — odzyskano pięć rekordów</w:t>
+      </w:r>
+    </w:p>
+    <w:p>
+      <w:r>
+        <w:drawing>
+          <wp:inline xmlns:a="http://schemas.openxmlformats.org/drawingml/2006/main" xmlns:pic="http://schemas.openxmlformats.org/drawingml/2006/picture">
+            <wp:extent cx="9612000" cy="5106375"/>
+            <wp:docPr id="5" name="Picture 5"/>
+            <wp:cNvGraphicFramePr>
+              <a:graphicFrameLocks noChangeAspect="1"/>
+            </wp:cNvGraphicFramePr>
+            <a:graphic>
+              <a:graphicData uri="http://schemas.openxmlformats.org/drawingml/2006/picture">
+                <pic:pic>
+                  <pic:nvPicPr>
+                    <pic:cNvPr id="0" name="backup-demo-restored-rows.jpg"/>
+                    <pic:cNvPicPr/>
+                  </pic:nvPicPr>
+                  <pic:blipFill>
+                    <a:blip r:embed="rId13"/>
+                    <a:stretch>
+                      <a:fillRect/>
+                    </a:stretch>
+                  </pic:blipFill>
+                  <pic:spPr>
+                    <a:xfrm>
+                      <a:off x="0" y="0"/>
+                      <a:ext cx="9612000" cy="5106375"/>
                     </a:xfrm>
                     <a:prstGeom prst="rect"/>
                   </pic:spPr>
@@ -79,8 +291,8 @@
       </w:r>
     </w:p>
     <w:sectPr>
-      <w:pgSz w:w="12240" w:h="15840"/>
-      <w:pgMar w:top="1440" w:right="1800" w:bottom="1440" w:left="1800" w:header="720" w:footer="720" w:gutter="0"/>
+      <w:pgSz w:w="16838" w:h="11906" w:orient="landscape"/>
+      <w:pgMar w:top="794" w:right="907" w:bottom="794" w:left="907" w:header="720" w:footer="720" w:gutter="0"/>
       <w:cols w:space="720"/>
       <w:docGrid w:linePitch="360"/>
     </w:sectPr>
@@ -451,6 +663,13 @@
     <w:name w:val="Normal"/>
     <w:qFormat/>
     <w:rsid w:val="00FC693F"/>
+    <w:pPr>
+      <w:spacing w:after="140"/>
+    </w:pPr>
+    <w:rPr>
+      <w:rFonts w:ascii="Calibri" w:hAnsi="Calibri"/>
+      <w:sz w:val="22"/>
+    </w:rPr>
   </w:style>
   <w:style w:type="paragraph" w:styleId="Header">
     <w:name w:val="header"/>

</xml_diff>